<commit_message>
quizzes are done now
</commit_message>
<xml_diff>
--- a/docs/admin/overview.docx
+++ b/docs/admin/overview.docx
@@ -1015,7 +1015,7 @@
       <w:b/>
       <w:color w:themeColor="accent1" w:themeShade="BF" w:val="0F4761"/>
       <w:sz w:val="28"/>
-      <w:szCs w:val="40"/>
+      <w:szCs w:val="28"/>
     </w:rPr>
   </w:style>
   <w:style w:styleId="Heading2" w:type="paragraph">
@@ -1037,7 +1037,7 @@
     <w:rPr>
       <w:rFonts w:asciiTheme="majorHAnsi" w:cstheme="majorBidi" w:eastAsiaTheme="majorEastAsia" w:hAnsiTheme="majorHAnsi"/>
       <w:color w:themeColor="accent1" w:themeShade="BF" w:val="0F4761"/>
-      <w:szCs w:val="32"/>
+      <w:szCs w:val="28"/>
     </w:rPr>
   </w:style>
   <w:style w:styleId="Heading3" w:type="paragraph">
@@ -1349,8 +1349,8 @@
       <w:rFonts w:asciiTheme="majorHAnsi" w:cstheme="majorBidi" w:eastAsiaTheme="majorEastAsia" w:hAnsiTheme="majorHAnsi"/>
       <w:spacing w:val="-10"/>
       <w:kern w:val="28"/>
-      <w:sz w:val="56"/>
-      <w:szCs w:val="56"/>
+      <w:sz w:val="28"/>
+      <w:szCs w:val="28"/>
     </w:rPr>
   </w:style>
   <w:style w:customStyle="1" w:styleId="TitleChar" w:type="character">
@@ -1363,8 +1363,8 @@
       <w:rFonts w:asciiTheme="majorHAnsi" w:cstheme="majorBidi" w:eastAsiaTheme="majorEastAsia" w:hAnsiTheme="majorHAnsi"/>
       <w:spacing w:val="-10"/>
       <w:kern w:val="28"/>
-      <w:sz w:val="56"/>
-      <w:szCs w:val="56"/>
+      <w:sz w:val="28"/>
+      <w:szCs w:val="28"/>
     </w:rPr>
   </w:style>
   <w:style w:styleId="Subtitle" w:type="paragraph">

</xml_diff>